<commit_message>
Made changes as suggested by supervisor
</commit_message>
<xml_diff>
--- a/docs/1-proposal/CA326_Project_Proposal_Form.docx
+++ b/docs/1-proposal/CA326_Project_Proposal_Form.docx
@@ -89,7 +89,15 @@
           <w:rFonts w:ascii="Helvetica Neue" w:eastAsia="Helvetica Neue" w:hAnsi="Helvetica Neue" w:cs="Helvetica Neue"/>
           <w:color w:val="000000"/>
         </w:rPr>
-        <w:t>: FootStat</w:t>
+        <w:t xml:space="preserve">: </w:t>
+      </w:r>
+      <w:r>
+        <w:rPr>
+          <w:rFonts w:ascii="Helvetica Neue" w:eastAsia="Helvetica Neue" w:hAnsi="Helvetica Neue" w:cs="Helvetica Neue"/>
+          <w:color w:val="000000"/>
+          <w:u w:val="single"/>
+        </w:rPr>
+        <w:t>FootStat</w:t>
       </w:r>
     </w:p>
     <w:p>
@@ -498,6 +506,114 @@
           <w:szCs w:val="22"/>
         </w:rPr>
         <w:t xml:space="preserve"> RD rating system to estimate the accuracy of ELO results. </w:t>
+      </w:r>
+      <w:r>
+        <w:rPr>
+          <w:rFonts w:ascii="Arial" w:eastAsia="Arial" w:hAnsi="Arial" w:cs="Arial"/>
+          <w:color w:val="000000"/>
+          <w:sz w:val="22"/>
+          <w:szCs w:val="22"/>
+        </w:rPr>
+        <w:t xml:space="preserve">Additionally, users will have the </w:t>
+      </w:r>
+      <w:r>
+        <w:rPr>
+          <w:rFonts w:ascii="Arial" w:eastAsia="Arial" w:hAnsi="Arial" w:cs="Arial"/>
+          <w:color w:val="000000"/>
+          <w:sz w:val="22"/>
+          <w:szCs w:val="22"/>
+        </w:rPr>
+        <w:t>access to features standard on most sports stat</w:t>
+      </w:r>
+      <w:r>
+        <w:rPr>
+          <w:rFonts w:ascii="Arial" w:eastAsia="Arial" w:hAnsi="Arial" w:cs="Arial"/>
+          <w:color w:val="000000"/>
+          <w:sz w:val="22"/>
+          <w:szCs w:val="22"/>
+        </w:rPr>
+        <w:t>istics</w:t>
+      </w:r>
+      <w:r>
+        <w:rPr>
+          <w:rFonts w:ascii="Arial" w:eastAsia="Arial" w:hAnsi="Arial" w:cs="Arial"/>
+          <w:color w:val="000000"/>
+          <w:sz w:val="22"/>
+          <w:szCs w:val="22"/>
+        </w:rPr>
+        <w:t xml:space="preserve"> app</w:t>
+      </w:r>
+      <w:r>
+        <w:rPr>
+          <w:rFonts w:ascii="Arial" w:eastAsia="Arial" w:hAnsi="Arial" w:cs="Arial"/>
+          <w:color w:val="000000"/>
+          <w:sz w:val="22"/>
+          <w:szCs w:val="22"/>
+        </w:rPr>
+        <w:t>lications</w:t>
+      </w:r>
+      <w:r>
+        <w:rPr>
+          <w:rFonts w:ascii="Arial" w:eastAsia="Arial" w:hAnsi="Arial" w:cs="Arial"/>
+          <w:color w:val="000000"/>
+          <w:sz w:val="22"/>
+          <w:szCs w:val="22"/>
+        </w:rPr>
+        <w:t xml:space="preserve">, for example, viewing the scores </w:t>
+      </w:r>
+      <w:r>
+        <w:rPr>
+          <w:rFonts w:ascii="Arial" w:eastAsia="Arial" w:hAnsi="Arial" w:cs="Arial"/>
+          <w:color w:val="000000"/>
+          <w:sz w:val="22"/>
+          <w:szCs w:val="22"/>
+        </w:rPr>
+        <w:t>from</w:t>
+      </w:r>
+      <w:r>
+        <w:rPr>
+          <w:rFonts w:ascii="Arial" w:eastAsia="Arial" w:hAnsi="Arial" w:cs="Arial"/>
+          <w:color w:val="000000"/>
+          <w:sz w:val="22"/>
+          <w:szCs w:val="22"/>
+        </w:rPr>
+        <w:t xml:space="preserve"> </w:t>
+      </w:r>
+      <w:r>
+        <w:rPr>
+          <w:rFonts w:ascii="Arial" w:eastAsia="Arial" w:hAnsi="Arial" w:cs="Arial"/>
+          <w:color w:val="000000"/>
+          <w:sz w:val="22"/>
+          <w:szCs w:val="22"/>
+        </w:rPr>
+        <w:t>previous</w:t>
+      </w:r>
+      <w:r>
+        <w:rPr>
+          <w:rFonts w:ascii="Arial" w:eastAsia="Arial" w:hAnsi="Arial" w:cs="Arial"/>
+          <w:color w:val="000000"/>
+          <w:sz w:val="22"/>
+          <w:szCs w:val="22"/>
+        </w:rPr>
+        <w:t xml:space="preserve"> games, viewing upcoming match</w:t>
+      </w:r>
+      <w:r>
+        <w:rPr>
+          <w:rFonts w:ascii="Arial" w:eastAsia="Arial" w:hAnsi="Arial" w:cs="Arial"/>
+          <w:color w:val="000000"/>
+          <w:sz w:val="22"/>
+          <w:szCs w:val="22"/>
+        </w:rPr>
+        <w:t xml:space="preserve"> information, player information (e.g. goals, passes, cards etc.) and match tables. </w:t>
+      </w:r>
+      <w:r>
+        <w:rPr>
+          <w:rFonts w:ascii="Arial" w:eastAsia="Arial" w:hAnsi="Arial" w:cs="Arial"/>
+          <w:color w:val="000000"/>
+          <w:sz w:val="22"/>
+          <w:szCs w:val="22"/>
+        </w:rPr>
+        <w:t xml:space="preserve">Information is planned to be viewable in various formats, for example, a user may select a certain league and filter out all the players that participated in it in order of descending goals. </w:t>
       </w:r>
     </w:p>
     <w:p>
@@ -756,7 +872,61 @@
           <w:sz w:val="22"/>
           <w:szCs w:val="22"/>
         </w:rPr>
-        <w:t xml:space="preserve"> and Yahoo Sports), we tried to think of ways they can be improved and more statistics we’d like to see that weren’t on those apps. </w:t>
+        <w:t xml:space="preserve"> and Yahoo Sports), we tried to think of ways they can be improved and more statistics we</w:t>
+      </w:r>
+      <w:r>
+        <w:rPr>
+          <w:rFonts w:ascii="Arial" w:eastAsia="Arial" w:hAnsi="Arial" w:cs="Arial"/>
+          <w:color w:val="000000"/>
+          <w:sz w:val="22"/>
+          <w:szCs w:val="22"/>
+        </w:rPr>
+        <w:t xml:space="preserve"> would </w:t>
+      </w:r>
+      <w:r>
+        <w:rPr>
+          <w:rFonts w:ascii="Arial" w:eastAsia="Arial" w:hAnsi="Arial" w:cs="Arial"/>
+          <w:color w:val="000000"/>
+          <w:sz w:val="22"/>
+          <w:szCs w:val="22"/>
+        </w:rPr>
+        <w:t>like to see that were</w:t>
+      </w:r>
+      <w:r>
+        <w:rPr>
+          <w:rFonts w:ascii="Arial" w:eastAsia="Arial" w:hAnsi="Arial" w:cs="Arial"/>
+          <w:color w:val="000000"/>
+          <w:sz w:val="22"/>
+          <w:szCs w:val="22"/>
+        </w:rPr>
+        <w:t xml:space="preserve"> not </w:t>
+      </w:r>
+      <w:r>
+        <w:rPr>
+          <w:rFonts w:ascii="Arial" w:eastAsia="Arial" w:hAnsi="Arial" w:cs="Arial"/>
+          <w:color w:val="000000"/>
+          <w:sz w:val="22"/>
+          <w:szCs w:val="22"/>
+        </w:rPr>
+        <w:t>on those app</w:t>
+      </w:r>
+      <w:r>
+        <w:rPr>
+          <w:rFonts w:ascii="Arial" w:eastAsia="Arial" w:hAnsi="Arial" w:cs="Arial"/>
+          <w:color w:val="000000"/>
+          <w:sz w:val="22"/>
+          <w:szCs w:val="22"/>
+        </w:rPr>
+        <w:t>lications</w:t>
+      </w:r>
+      <w:r>
+        <w:rPr>
+          <w:rFonts w:ascii="Arial" w:eastAsia="Arial" w:hAnsi="Arial" w:cs="Arial"/>
+          <w:color w:val="000000"/>
+          <w:sz w:val="22"/>
+          <w:szCs w:val="22"/>
+        </w:rPr>
+        <w:t xml:space="preserve">. </w:t>
       </w:r>
     </w:p>
     <w:p>
@@ -855,40 +1025,46 @@
           <w:sz w:val="22"/>
           <w:szCs w:val="22"/>
         </w:rPr>
-        <w:t>The goal is to create an android app that can track various statistics for European football leagues, have the ability to contrast and compare teams or potentially players, and rank teams and players using the algorithms mentioned previously.</w:t>
-      </w:r>
-    </w:p>
-    <w:p>
-      <w:pPr>
-        <w:pBdr>
-          <w:top w:val="nil"/>
-          <w:left w:val="nil"/>
-          <w:bottom w:val="nil"/>
-          <w:right w:val="nil"/>
-          <w:between w:val="nil"/>
-        </w:pBdr>
-        <w:rPr>
-          <w:rFonts w:ascii="Times New Roman" w:eastAsia="Times New Roman" w:hAnsi="Times New Roman" w:cs="Times New Roman"/>
-          <w:i/>
-          <w:color w:val="595959"/>
-        </w:rPr>
-      </w:pPr>
-    </w:p>
-    <w:p>
-      <w:pPr>
-        <w:pBdr>
-          <w:top w:val="nil"/>
-          <w:left w:val="nil"/>
-          <w:bottom w:val="nil"/>
-          <w:right w:val="nil"/>
-          <w:between w:val="nil"/>
-        </w:pBdr>
-        <w:rPr>
-          <w:rFonts w:ascii="Times New Roman" w:eastAsia="Times New Roman" w:hAnsi="Times New Roman" w:cs="Times New Roman"/>
-          <w:i/>
-          <w:color w:val="595959"/>
-        </w:rPr>
-      </w:pPr>
+        <w:t xml:space="preserve">The goal is to create an android app that can track various statistics for European football leagues, have the ability to contrast and compare teams or potentially players, and rank teams and players using the </w:t>
+      </w:r>
+      <w:r>
+        <w:rPr>
+          <w:rFonts w:ascii="Arial" w:eastAsia="Arial" w:hAnsi="Arial" w:cs="Arial"/>
+          <w:color w:val="000000"/>
+          <w:sz w:val="22"/>
+          <w:szCs w:val="22"/>
+        </w:rPr>
+        <w:t xml:space="preserve">ELO rating and </w:t>
+      </w:r>
+      <w:proofErr w:type="spellStart"/>
+      <w:r>
+        <w:rPr>
+          <w:rFonts w:ascii="Arial" w:eastAsia="Arial" w:hAnsi="Arial" w:cs="Arial"/>
+          <w:color w:val="000000"/>
+          <w:sz w:val="22"/>
+          <w:szCs w:val="22"/>
+        </w:rPr>
+        <w:t>Glicko</w:t>
+      </w:r>
+      <w:proofErr w:type="spellEnd"/>
+      <w:r>
+        <w:rPr>
+          <w:rFonts w:ascii="Arial" w:eastAsia="Arial" w:hAnsi="Arial" w:cs="Arial"/>
+          <w:color w:val="000000"/>
+          <w:sz w:val="22"/>
+          <w:szCs w:val="22"/>
+        </w:rPr>
+        <w:t xml:space="preserve"> RD </w:t>
+      </w:r>
+      <w:r>
+        <w:rPr>
+          <w:rFonts w:ascii="Arial" w:eastAsia="Arial" w:hAnsi="Arial" w:cs="Arial"/>
+          <w:color w:val="000000"/>
+          <w:sz w:val="22"/>
+          <w:szCs w:val="22"/>
+        </w:rPr>
+        <w:t>algorithms mentioned previously.</w:t>
+      </w:r>
     </w:p>
     <w:p>
       <w:pPr>
@@ -1003,7 +1179,24 @@
           <w:szCs w:val="27"/>
         </w:rPr>
       </w:pPr>
-      <w:r>
+    </w:p>
+    <w:p>
+      <w:pPr>
+        <w:numPr>
+          <w:ilvl w:val="2"/>
+          <w:numId w:val="1"/>
+        </w:numPr>
+        <w:pBdr>
+          <w:top w:val="nil"/>
+          <w:left w:val="nil"/>
+          <w:bottom w:val="nil"/>
+          <w:right w:val="nil"/>
+          <w:between w:val="nil"/>
+        </w:pBdr>
+        <w:tabs>
+          <w:tab w:val="left" w:pos="0"/>
+        </w:tabs>
+        <w:spacing w:before="100" w:after="100"/>
         <w:rPr>
           <w:rFonts w:ascii="Times New Roman" w:eastAsia="Times New Roman" w:hAnsi="Times New Roman" w:cs="Times New Roman"/>
           <w:b/>
@@ -1011,6 +1204,15 @@
           <w:sz w:val="27"/>
           <w:szCs w:val="27"/>
         </w:rPr>
+      </w:pPr>
+      <w:r>
+        <w:rPr>
+          <w:rFonts w:ascii="Times New Roman" w:eastAsia="Times New Roman" w:hAnsi="Times New Roman" w:cs="Times New Roman"/>
+          <w:b/>
+          <w:color w:val="000000"/>
+          <w:sz w:val="27"/>
+          <w:szCs w:val="27"/>
+        </w:rPr>
         <w:lastRenderedPageBreak/>
         <w:t>Programming language(s) and tools</w:t>
       </w:r>
@@ -1193,7 +1395,10 @@
           <w:between w:val="nil"/>
         </w:pBdr>
         <w:rPr>
-          <w:color w:val="000000"/>
+          <w:rFonts w:ascii="Arial" w:eastAsia="Arial" w:hAnsi="Arial" w:cs="Arial"/>
+          <w:color w:val="000000"/>
+          <w:sz w:val="22"/>
+          <w:szCs w:val="22"/>
         </w:rPr>
       </w:pPr>
       <w:r>
@@ -1328,6 +1533,120 @@
           <w:szCs w:val="22"/>
         </w:rPr>
         <w:t>. For designing and prototyping the UI, we will use Adobe XD in combination with Android Studio’s design tools.</w:t>
+      </w:r>
+    </w:p>
+    <w:p>
+      <w:pPr>
+        <w:pBdr>
+          <w:top w:val="nil"/>
+          <w:left w:val="nil"/>
+          <w:bottom w:val="nil"/>
+          <w:right w:val="nil"/>
+          <w:between w:val="nil"/>
+        </w:pBdr>
+        <w:rPr>
+          <w:rFonts w:ascii="Arial" w:eastAsia="Arial" w:hAnsi="Arial" w:cs="Arial"/>
+          <w:color w:val="000000"/>
+          <w:sz w:val="22"/>
+          <w:szCs w:val="22"/>
+        </w:rPr>
+      </w:pPr>
+    </w:p>
+    <w:p>
+      <w:pPr>
+        <w:pBdr>
+          <w:top w:val="nil"/>
+          <w:left w:val="nil"/>
+          <w:bottom w:val="nil"/>
+          <w:right w:val="nil"/>
+          <w:between w:val="nil"/>
+        </w:pBdr>
+        <w:rPr>
+          <w:color w:val="000000"/>
+        </w:rPr>
+      </w:pPr>
+      <w:r>
+        <w:rPr>
+          <w:rFonts w:ascii="Arial" w:eastAsia="Arial" w:hAnsi="Arial" w:cs="Arial"/>
+          <w:color w:val="000000"/>
+          <w:sz w:val="22"/>
+          <w:szCs w:val="22"/>
+        </w:rPr>
+        <w:t>Our Java/Kotlin code will be tested using Junit 5</w:t>
+      </w:r>
+      <w:r>
+        <w:rPr>
+          <w:rFonts w:ascii="Arial" w:eastAsia="Arial" w:hAnsi="Arial" w:cs="Arial"/>
+          <w:color w:val="000000"/>
+          <w:sz w:val="22"/>
+          <w:szCs w:val="22"/>
+        </w:rPr>
+        <w:t xml:space="preserve"> and debugging tools integrated into Idea and Android Studio</w:t>
+      </w:r>
+      <w:r>
+        <w:rPr>
+          <w:rFonts w:ascii="Arial" w:eastAsia="Arial" w:hAnsi="Arial" w:cs="Arial"/>
+          <w:color w:val="000000"/>
+          <w:sz w:val="22"/>
+          <w:szCs w:val="22"/>
+        </w:rPr>
+        <w:t>. Features will be tested as much as possible on separate git branches before being merged to the master branch. SQLite code will be tested using</w:t>
+      </w:r>
+      <w:r>
+        <w:rPr>
+          <w:rFonts w:ascii="Arial" w:eastAsia="Arial" w:hAnsi="Arial" w:cs="Arial"/>
+          <w:color w:val="000000"/>
+          <w:sz w:val="22"/>
+          <w:szCs w:val="22"/>
+        </w:rPr>
+        <w:t xml:space="preserve"> the following</w:t>
+      </w:r>
+      <w:r>
+        <w:rPr>
+          <w:rFonts w:ascii="Arial" w:eastAsia="Arial" w:hAnsi="Arial" w:cs="Arial"/>
+          <w:color w:val="000000"/>
+          <w:sz w:val="22"/>
+          <w:szCs w:val="22"/>
+        </w:rPr>
+        <w:t xml:space="preserve"> test harnesses: TCL tests</w:t>
+      </w:r>
+      <w:r>
+        <w:rPr>
+          <w:rFonts w:ascii="Arial" w:eastAsia="Arial" w:hAnsi="Arial" w:cs="Arial"/>
+          <w:color w:val="000000"/>
+          <w:sz w:val="22"/>
+          <w:szCs w:val="22"/>
+        </w:rPr>
+        <w:t xml:space="preserve">, TH3 tests, SQL logic tests. These will validate the basic integrity and logic of our databases. Further tests, speedtest1 and </w:t>
+      </w:r>
+      <w:proofErr w:type="spellStart"/>
+      <w:r>
+        <w:rPr>
+          <w:rFonts w:ascii="Arial" w:eastAsia="Arial" w:hAnsi="Arial" w:cs="Arial"/>
+          <w:color w:val="000000"/>
+          <w:sz w:val="22"/>
+          <w:szCs w:val="22"/>
+        </w:rPr>
+        <w:t>mptester</w:t>
+      </w:r>
+      <w:proofErr w:type="spellEnd"/>
+      <w:r>
+        <w:rPr>
+          <w:rFonts w:ascii="Arial" w:eastAsia="Arial" w:hAnsi="Arial" w:cs="Arial"/>
+          <w:color w:val="000000"/>
+          <w:sz w:val="22"/>
+          <w:szCs w:val="22"/>
+        </w:rPr>
+        <w:t xml:space="preserve">, will be used to measure the speed and performance of database </w:t>
+      </w:r>
+      <w:r>
+        <w:rPr>
+          <w:rFonts w:ascii="Arial" w:eastAsia="Arial" w:hAnsi="Arial" w:cs="Arial"/>
+          <w:color w:val="000000"/>
+          <w:sz w:val="22"/>
+          <w:szCs w:val="22"/>
+        </w:rPr>
+        <w:t>access and usage.</w:t>
       </w:r>
     </w:p>
     <w:p>

</xml_diff>